<commit_message>
feat: add documentation for information administration and SASI procedures to public assets
</commit_message>
<xml_diff>
--- a/ciberseguridad/portal-tic/public/Administracion_Informacion.docx
+++ b/ciberseguridad/portal-tic/public/Administracion_Informacion.docx
@@ -6,6 +6,7 @@
       <w:tblPr>
         <w:tblStyle w:val="TableGrid"/>
         <w:tblW w:type="auto" w:w="0"/>
+        <w:tblLayout w:type="fixed"/>
         <w:tblLook w:firstColumn="1" w:firstRow="1" w:lastColumn="0" w:lastRow="0" w:noHBand="0" w:noVBand="1" w:val="04A0"/>
       </w:tblPr>
       <w:tblGrid>
@@ -16,7 +17,7 @@
       <w:tr>
         <w:tc>
           <w:tcPr>
-            <w:tcW w:type="dxa" w:w="2880"/>
+            <w:tcW w:type="dxa" w:w="2160"/>
             <w:vMerge w:val="restart"/>
             <w:tcBorders>
               <w:top w:val="single" w:sz="4" w:space="0" w:color="000000"/>
@@ -74,7 +75,7 @@
         </w:tc>
         <w:tc>
           <w:tcPr>
-            <w:tcW w:type="dxa" w:w="2880"/>
+            <w:tcW w:type="dxa" w:w="6480"/>
             <w:tcBorders>
               <w:top w:val="single" w:sz="4" w:space="0" w:color="000000"/>
               <w:left w:val="single" w:sz="4" w:space="0" w:color="000000"/>
@@ -96,7 +97,7 @@
         </w:tc>
         <w:tc>
           <w:tcPr>
-            <w:tcW w:type="dxa" w:w="2880"/>
+            <w:tcW w:type="dxa" w:w="2160"/>
             <w:vMerge w:val="restart"/>
             <w:tcBorders>
               <w:top w:val="single" w:sz="4" w:space="0" w:color="000000"/>
@@ -118,7 +119,9 @@
             <w:r>
               <w:t>DPyD</w:t>
               <w:br/>
-              <w:t>Versión 1</w:t>
+              <w:t>Versión 1:</w:t>
+              <w:br/>
+              <w:t>Enero, 2020</w:t>
             </w:r>
           </w:p>
         </w:tc>
@@ -133,7 +136,7 @@
         </w:tc>
         <w:tc>
           <w:tcPr>
-            <w:tcW w:type="dxa" w:w="2880"/>
+            <w:tcW w:type="dxa" w:w="6480"/>
             <w:tcBorders>
               <w:top w:val="single" w:sz="4" w:space="0" w:color="000000"/>
               <w:left w:val="single" w:sz="4" w:space="0" w:color="000000"/>
@@ -167,6 +170,7 @@
       <w:tblPr>
         <w:tblStyle w:val="TableGrid"/>
         <w:tblW w:type="auto" w:w="0"/>
+        <w:tblLayout w:type="fixed"/>
         <w:tblLook w:firstColumn="1" w:firstRow="1" w:lastColumn="0" w:lastRow="0" w:noHBand="0" w:noVBand="1" w:val="04A0"/>
       </w:tblPr>
       <w:tblGrid>
@@ -211,7 +215,7 @@
       <w:tr>
         <w:tc>
           <w:tcPr>
-            <w:tcW w:type="dxa" w:w="2880"/>
+            <w:tcW w:type="dxa" w:w="3600"/>
             <w:tcBorders>
               <w:top w:val="single" w:sz="4" w:space="0" w:color="000000"/>
               <w:left w:val="single" w:sz="4" w:space="0" w:color="000000"/>
@@ -227,7 +231,7 @@
         </w:tc>
         <w:tc>
           <w:tcPr>
-            <w:tcW w:type="dxa" w:w="2880"/>
+            <w:tcW w:type="dxa" w:w="4320"/>
             <w:tcBorders>
               <w:top w:val="single" w:sz="4" w:space="0" w:color="000000"/>
               <w:left w:val="single" w:sz="4" w:space="0" w:color="000000"/>
@@ -253,7 +257,9 @@
           </w:tcPr>
           <w:p>
             <w:r>
-              <w:t>Código/Páginas: BNPHU-TIC-002</w:t>
+              <w:t>Código/Páginas:</w:t>
+              <w:br/>
+              <w:t>BNPHU-TIC-002</w:t>
             </w:r>
           </w:p>
         </w:tc>
@@ -261,7 +267,7 @@
       <w:tr>
         <w:tc>
           <w:tcPr>
-            <w:tcW w:type="dxa" w:w="8640"/>
+            <w:tcW w:type="dxa" w:w="10800"/>
             <w:gridSpan w:val="3"/>
             <w:tcBorders>
               <w:top w:val="single" w:sz="4" w:space="0" w:color="000000"/>

</xml_diff>

<commit_message>
feat: add SASI procedure and information administration documentation to public assets
</commit_message>
<xml_diff>
--- a/ciberseguridad/portal-tic/public/Administracion_Informacion.docx
+++ b/ciberseguridad/portal-tic/public/Administracion_Informacion.docx
@@ -2,169 +2,6 @@
 <file path=word/document.xml><?xml version="1.0" encoding="utf-8"?>
 <w:document xmlns:wpc="http://schemas.microsoft.com/office/word/2010/wordprocessingCanvas" xmlns:mo="http://schemas.microsoft.com/office/mac/office/2008/main" xmlns:mc="http://schemas.openxmlformats.org/markup-compatibility/2006" xmlns:mv="urn:schemas-microsoft-com:mac:vml" xmlns:o="urn:schemas-microsoft-com:office:office" xmlns:r="http://schemas.openxmlformats.org/officeDocument/2006/relationships" xmlns:m="http://schemas.openxmlformats.org/officeDocument/2006/math" xmlns:v="urn:schemas-microsoft-com:vml" xmlns:wp14="http://schemas.microsoft.com/office/word/2010/wordprocessingDrawing" xmlns:wp="http://schemas.openxmlformats.org/drawingml/2006/wordprocessingDrawing" xmlns:w10="urn:schemas-microsoft-com:office:word" xmlns:w="http://schemas.openxmlformats.org/wordprocessingml/2006/main" xmlns:w14="http://schemas.microsoft.com/office/word/2010/wordml" xmlns:wpg="http://schemas.microsoft.com/office/word/2010/wordprocessingGroup" xmlns:wpi="http://schemas.microsoft.com/office/word/2010/wordprocessingInk" xmlns:wne="http://schemas.microsoft.com/office/word/2006/wordml" xmlns:wps="http://schemas.microsoft.com/office/word/2010/wordprocessingShape" mc:Ignorable="w14 wp14">
   <w:body>
-    <w:tbl>
-      <w:tblPr>
-        <w:tblStyle w:val="TableGrid"/>
-        <w:tblW w:type="auto" w:w="0"/>
-        <w:tblLayout w:type="fixed"/>
-        <w:tblLook w:firstColumn="1" w:firstRow="1" w:lastColumn="0" w:lastRow="0" w:noHBand="0" w:noVBand="1" w:val="04A0"/>
-      </w:tblPr>
-      <w:tblGrid>
-        <w:gridCol w:w="2880"/>
-        <w:gridCol w:w="2880"/>
-        <w:gridCol w:w="2880"/>
-      </w:tblGrid>
-      <w:tr>
-        <w:tc>
-          <w:tcPr>
-            <w:tcW w:type="dxa" w:w="2160"/>
-            <w:vMerge w:val="restart"/>
-            <w:tcBorders>
-              <w:top w:val="single" w:sz="4" w:space="0" w:color="000000"/>
-              <w:left w:val="single" w:sz="4" w:space="0" w:color="000000"/>
-              <w:bottom w:val="single" w:sz="4" w:space="0" w:color="000000"/>
-              <w:right w:val="single" w:sz="4" w:space="0" w:color="000000"/>
-            </w:tcBorders>
-            <w:tcBorders>
-              <w:top w:val="single" w:sz="4" w:space="0" w:color="000000"/>
-              <w:left w:val="single" w:sz="4" w:space="0" w:color="000000"/>
-              <w:bottom w:val="single" w:sz="4" w:space="0" w:color="000000"/>
-              <w:right w:val="single" w:sz="4" w:space="0" w:color="000000"/>
-            </w:tcBorders>
-          </w:tcPr>
-          <w:p>
-            <w:pPr>
-              <w:jc w:val="center"/>
-            </w:pPr>
-            <w:r/>
-            <w:r>
-              <w:drawing>
-                <wp:inline xmlns:a="http://schemas.openxmlformats.org/drawingml/2006/main" xmlns:pic="http://schemas.openxmlformats.org/drawingml/2006/picture">
-                  <wp:extent cx="1097280" cy="817194"/>
-                  <wp:docPr id="1" name="Picture 1"/>
-                  <wp:cNvGraphicFramePr>
-                    <a:graphicFrameLocks noChangeAspect="1"/>
-                  </wp:cNvGraphicFramePr>
-                  <a:graphic>
-                    <a:graphicData uri="http://schemas.openxmlformats.org/drawingml/2006/picture">
-                      <pic:pic>
-                        <pic:nvPicPr>
-                          <pic:cNvPr id="0" name="logo-bnphu.png"/>
-                          <pic:cNvPicPr/>
-                        </pic:nvPicPr>
-                        <pic:blipFill>
-                          <a:blip r:embed="rId9"/>
-                          <a:stretch>
-                            <a:fillRect/>
-                          </a:stretch>
-                        </pic:blipFill>
-                        <pic:spPr>
-                          <a:xfrm>
-                            <a:off x="0" y="0"/>
-                            <a:ext cx="1097280" cy="817194"/>
-                          </a:xfrm>
-                          <a:prstGeom prst="rect"/>
-                        </pic:spPr>
-                      </pic:pic>
-                    </a:graphicData>
-                  </a:graphic>
-                </wp:inline>
-              </w:drawing>
-            </w:r>
-          </w:p>
-        </w:tc>
-        <w:tc>
-          <w:tcPr>
-            <w:tcW w:type="dxa" w:w="6480"/>
-            <w:tcBorders>
-              <w:top w:val="single" w:sz="4" w:space="0" w:color="000000"/>
-              <w:left w:val="single" w:sz="4" w:space="0" w:color="000000"/>
-              <w:bottom w:val="single" w:sz="4" w:space="0" w:color="000000"/>
-              <w:right w:val="single" w:sz="4" w:space="0" w:color="000000"/>
-            </w:tcBorders>
-          </w:tcPr>
-          <w:p>
-            <w:pPr>
-              <w:jc w:val="center"/>
-            </w:pPr>
-            <w:r>
-              <w:rPr>
-                <w:b/>
-              </w:rPr>
-              <w:t>BIBLIOTECA NACIONAL PEDRO HENRÍQUEZ UREÑA</w:t>
-            </w:r>
-          </w:p>
-        </w:tc>
-        <w:tc>
-          <w:tcPr>
-            <w:tcW w:type="dxa" w:w="2160"/>
-            <w:vMerge w:val="restart"/>
-            <w:tcBorders>
-              <w:top w:val="single" w:sz="4" w:space="0" w:color="000000"/>
-              <w:left w:val="single" w:sz="4" w:space="0" w:color="000000"/>
-              <w:bottom w:val="single" w:sz="4" w:space="0" w:color="000000"/>
-              <w:right w:val="single" w:sz="4" w:space="0" w:color="000000"/>
-            </w:tcBorders>
-            <w:tcBorders>
-              <w:top w:val="single" w:sz="4" w:space="0" w:color="000000"/>
-              <w:left w:val="single" w:sz="4" w:space="0" w:color="000000"/>
-              <w:bottom w:val="single" w:sz="4" w:space="0" w:color="000000"/>
-              <w:right w:val="single" w:sz="4" w:space="0" w:color="000000"/>
-            </w:tcBorders>
-          </w:tcPr>
-          <w:p>
-            <w:pPr>
-              <w:jc w:val="center"/>
-            </w:pPr>
-            <w:r>
-              <w:t>DPyD</w:t>
-              <w:br/>
-              <w:t>Versión 1:</w:t>
-              <w:br/>
-              <w:t>Enero, 2020</w:t>
-            </w:r>
-          </w:p>
-        </w:tc>
-      </w:tr>
-      <w:tr>
-        <w:tc>
-          <w:tcPr>
-            <w:tcW w:type="dxa" w:w="2880"/>
-            <w:vMerge/>
-          </w:tcPr>
-          <w:p/>
-        </w:tc>
-        <w:tc>
-          <w:tcPr>
-            <w:tcW w:type="dxa" w:w="6480"/>
-            <w:tcBorders>
-              <w:top w:val="single" w:sz="4" w:space="0" w:color="000000"/>
-              <w:left w:val="single" w:sz="4" w:space="0" w:color="000000"/>
-              <w:bottom w:val="single" w:sz="4" w:space="0" w:color="000000"/>
-              <w:right w:val="single" w:sz="4" w:space="0" w:color="000000"/>
-            </w:tcBorders>
-          </w:tcPr>
-          <w:p>
-            <w:pPr>
-              <w:jc w:val="center"/>
-            </w:pPr>
-            <w:r>
-              <w:rPr>
-                <w:b/>
-              </w:rPr>
-              <w:t>MANUAL DE POLÍTICAS Y PROCEDIMIENTOS</w:t>
-            </w:r>
-          </w:p>
-        </w:tc>
-        <w:tc>
-          <w:tcPr>
-            <w:tcW w:type="dxa" w:w="2880"/>
-            <w:vMerge/>
-          </w:tcPr>
-          <w:p/>
-        </w:tc>
-      </w:tr>
-    </w:tbl>
     <w:p/>
     <w:tbl>
       <w:tblPr>
@@ -1441,6 +1278,7 @@
       </w:tr>
     </w:tbl>
     <w:sectPr>
+      <w:headerReference w:type="default" r:id="rId9"/>
       <w:pgSz w:w="12240" w:h="15840"/>
       <w:pgMar w:top="1440" w:right="1800" w:bottom="1440" w:left="1800" w:header="720" w:footer="720" w:gutter="0"/>
       <w:cols w:space="720"/>
@@ -1448,6 +1286,174 @@
     </w:sectPr>
   </w:body>
 </w:document>
+</file>
+
+<file path=word/header1.xml><?xml version="1.0" encoding="utf-8"?>
+<w:hdr xmlns:m="http://schemas.openxmlformats.org/officeDocument/2006/math" xmlns:mc="http://schemas.openxmlformats.org/markup-compatibility/2006" xmlns:mo="http://schemas.microsoft.com/office/mac/office/2008/main" xmlns:mv="urn:schemas-microsoft-com:mac:vml" xmlns:o="urn:schemas-microsoft-com:office:office" xmlns:r="http://schemas.openxmlformats.org/officeDocument/2006/relationships" xmlns:v="urn:schemas-microsoft-com:vml" xmlns:w10="urn:schemas-microsoft-com:office:word" xmlns:w14="http://schemas.microsoft.com/office/word/2010/wordml" xmlns:w="http://schemas.openxmlformats.org/wordprocessingml/2006/main" xmlns:wne="http://schemas.microsoft.com/office/word/2006/wordml" xmlns:wp14="http://schemas.microsoft.com/office/word/2010/wordprocessingDrawing" xmlns:wp="http://schemas.openxmlformats.org/drawingml/2006/wordprocessingDrawing" xmlns:wpc="http://schemas.microsoft.com/office/word/2010/wordprocessingCanvas" xmlns:wpg="http://schemas.microsoft.com/office/word/2010/wordprocessingGroup" xmlns:wpi="http://schemas.microsoft.com/office/word/2010/wordprocessingInk" xmlns:wps="http://schemas.microsoft.com/office/word/2010/wordprocessingShape" mc:Ignorable="w14 wp14">
+  <w:tbl>
+    <w:tblPr>
+      <w:tblStyle w:val="TableGrid"/>
+      <w:tblW w:type="auto" w:w="0"/>
+      <w:tblLayout w:type="fixed"/>
+      <w:tblLook w:firstColumn="1" w:firstRow="1" w:lastColumn="0" w:lastRow="0" w:noHBand="0" w:noVBand="1" w:val="04A0"/>
+    </w:tblPr>
+    <w:tblGrid>
+      <w:gridCol w:w="3600"/>
+      <w:gridCol w:w="3600"/>
+      <w:gridCol w:w="3600"/>
+    </w:tblGrid>
+    <w:tr>
+      <w:tc>
+        <w:tcPr>
+          <w:tcW w:type="dxa" w:w="2160"/>
+          <w:vMerge w:val="restart"/>
+          <w:tcBorders>
+            <w:top w:val="single" w:sz="4" w:space="0" w:color="000000"/>
+            <w:left w:val="single" w:sz="4" w:space="0" w:color="000000"/>
+            <w:bottom w:val="single" w:sz="4" w:space="0" w:color="000000"/>
+            <w:right w:val="single" w:sz="4" w:space="0" w:color="000000"/>
+          </w:tcBorders>
+          <w:tcBorders>
+            <w:top w:val="single" w:sz="4" w:space="0" w:color="000000"/>
+            <w:left w:val="single" w:sz="4" w:space="0" w:color="000000"/>
+            <w:bottom w:val="single" w:sz="4" w:space="0" w:color="000000"/>
+            <w:right w:val="single" w:sz="4" w:space="0" w:color="000000"/>
+          </w:tcBorders>
+        </w:tcPr>
+        <w:p>
+          <w:pPr>
+            <w:jc w:val="center"/>
+          </w:pPr>
+          <w:r/>
+          <w:r>
+            <w:drawing>
+              <wp:inline xmlns:a="http://schemas.openxmlformats.org/drawingml/2006/main" xmlns:pic="http://schemas.openxmlformats.org/drawingml/2006/picture">
+                <wp:extent cx="1097280" cy="817194"/>
+                <wp:docPr id="1" name="Picture 1"/>
+                <wp:cNvGraphicFramePr>
+                  <a:graphicFrameLocks noChangeAspect="1"/>
+                </wp:cNvGraphicFramePr>
+                <a:graphic>
+                  <a:graphicData uri="http://schemas.openxmlformats.org/drawingml/2006/picture">
+                    <pic:pic>
+                      <pic:nvPicPr>
+                        <pic:cNvPr id="0" name="logo-bnphu.png"/>
+                        <pic:cNvPicPr/>
+                      </pic:nvPicPr>
+                      <pic:blipFill>
+                        <a:blip r:embed="rId1"/>
+                        <a:stretch>
+                          <a:fillRect/>
+                        </a:stretch>
+                      </pic:blipFill>
+                      <pic:spPr>
+                        <a:xfrm>
+                          <a:off x="0" y="0"/>
+                          <a:ext cx="1097280" cy="817194"/>
+                        </a:xfrm>
+                        <a:prstGeom prst="rect"/>
+                      </pic:spPr>
+                    </pic:pic>
+                  </a:graphicData>
+                </a:graphic>
+              </wp:inline>
+            </w:drawing>
+          </w:r>
+        </w:p>
+      </w:tc>
+      <w:tc>
+        <w:tcPr>
+          <w:tcW w:type="dxa" w:w="6480"/>
+          <w:tcBorders>
+            <w:top w:val="single" w:sz="4" w:space="0" w:color="000000"/>
+            <w:left w:val="single" w:sz="4" w:space="0" w:color="000000"/>
+            <w:bottom w:val="single" w:sz="4" w:space="0" w:color="000000"/>
+            <w:right w:val="single" w:sz="4" w:space="0" w:color="000000"/>
+          </w:tcBorders>
+        </w:tcPr>
+        <w:p>
+          <w:pPr>
+            <w:jc w:val="center"/>
+          </w:pPr>
+          <w:r>
+            <w:rPr>
+              <w:b/>
+            </w:rPr>
+            <w:t>BIBLIOTECA NACIONAL PEDRO HENRÍQUEZ UREÑA</w:t>
+          </w:r>
+        </w:p>
+      </w:tc>
+      <w:tc>
+        <w:tcPr>
+          <w:tcW w:type="dxa" w:w="2160"/>
+          <w:vMerge w:val="restart"/>
+          <w:tcBorders>
+            <w:top w:val="single" w:sz="4" w:space="0" w:color="000000"/>
+            <w:left w:val="single" w:sz="4" w:space="0" w:color="000000"/>
+            <w:bottom w:val="single" w:sz="4" w:space="0" w:color="000000"/>
+            <w:right w:val="single" w:sz="4" w:space="0" w:color="000000"/>
+          </w:tcBorders>
+          <w:tcBorders>
+            <w:top w:val="single" w:sz="4" w:space="0" w:color="000000"/>
+            <w:left w:val="single" w:sz="4" w:space="0" w:color="000000"/>
+            <w:bottom w:val="single" w:sz="4" w:space="0" w:color="000000"/>
+            <w:right w:val="single" w:sz="4" w:space="0" w:color="000000"/>
+          </w:tcBorders>
+        </w:tcPr>
+        <w:p>
+          <w:pPr>
+            <w:jc w:val="center"/>
+          </w:pPr>
+          <w:r>
+            <w:t>DPyD</w:t>
+            <w:br/>
+            <w:t>Versión 1:</w:t>
+            <w:br/>
+            <w:t>Enero, 2020</w:t>
+          </w:r>
+        </w:p>
+      </w:tc>
+    </w:tr>
+    <w:tr>
+      <w:tc>
+        <w:tcPr>
+          <w:tcW w:type="dxa" w:w="3600"/>
+          <w:vMerge/>
+        </w:tcPr>
+        <w:p/>
+      </w:tc>
+      <w:tc>
+        <w:tcPr>
+          <w:tcW w:type="dxa" w:w="6480"/>
+          <w:tcBorders>
+            <w:top w:val="single" w:sz="4" w:space="0" w:color="000000"/>
+            <w:left w:val="single" w:sz="4" w:space="0" w:color="000000"/>
+            <w:bottom w:val="single" w:sz="4" w:space="0" w:color="000000"/>
+            <w:right w:val="single" w:sz="4" w:space="0" w:color="000000"/>
+          </w:tcBorders>
+        </w:tcPr>
+        <w:p>
+          <w:pPr>
+            <w:jc w:val="center"/>
+          </w:pPr>
+          <w:r>
+            <w:rPr>
+              <w:b/>
+            </w:rPr>
+            <w:t>MANUAL DE POLÍTICAS Y PROCEDIMIENTOS</w:t>
+          </w:r>
+        </w:p>
+      </w:tc>
+      <w:tc>
+        <w:tcPr>
+          <w:tcW w:type="dxa" w:w="3600"/>
+          <w:vMerge/>
+        </w:tcPr>
+        <w:p/>
+      </w:tc>
+    </w:tr>
+  </w:tbl>
+</w:hdr>
 </file>
 
 <file path=word/numbering.xml><?xml version="1.0" encoding="utf-8"?>

</xml_diff>